<commit_message>
Rebuild legacy V17 resume binaries with verified numbers (Coordinator 95/95)
Deterministic rebuild from the updated generator. Also fixes the
legacy binaries' GlacierEQ start date (Jan 2025 -> 2023-Present).
Manifest legacy metadata (LEGACY_PRE_V23_NOT_CANONICAL status,
canonical surfaces, boundary) preserved; hashes updated to the
rebuilt binaries.
</commit_message>
<xml_diff>
--- a/site-v15/downloads/Casey_Barton_Resume.docx
+++ b/site-v15/downloads/Casey_Barton_Resume.docx
@@ -442,7 +442,7 @@
                 <w:color w:val="087A73"/>
                 <w:sz w:val="28"/>
               </w:rPr>
-              <w:t>62/62</w:t>
+              <w:t>95/95</w:t>
             </w:r>
           </w:p>
           <w:p>
@@ -579,7 +579,7 @@
                 <w:color w:val="5B6D75"/>
                 <w:sz w:val="16"/>
               </w:rPr>
-              <w:t>Jan 2025-Present</w:t>
+              <w:t>2023-Present</w:t>
             </w:r>
           </w:p>
         </w:tc>
@@ -1520,7 +1520,7 @@
                 <w:color w:val="087A73"/>
                 <w:sz w:val="14"/>
               </w:rPr>
-              <w:t>RECORDED 62/62</w:t>
+              <w:t>RECORDED 95/95</w:t>
             </w:r>
           </w:p>
           <w:p>
@@ -1583,7 +1583,7 @@
                 <w:color w:val="14232A"/>
                 <w:sz w:val="15"/>
               </w:rPr>
-              <w:t>62/62 recorded Python tests.</w:t>
+              <w:t>95/95 recorded Python tests.</w:t>
             </w:r>
           </w:p>
           <w:p>

</xml_diff>